<commit_message>
Clear retired address from remaining source and companion files
Finishes the sweep. Everything below carried advisor@rodney-ai.com,
meridian@rodney-ai.com or rodneyjerry@yahoo.com:

- resources/ companion files: MANIFEST, both delivery summaries and the
  four READMEs (13 refs)
- resources/enterprise-ai-video-script-90s.docx (2)
- Banking 2030 Part 3 draft, in both content/ and series/, plus its
  posting kit caption and pinned comment (6), and the Part 3 docx (3)
- Banking 2030 Parts 4 and 5 drafts and captions (5)

The docx files were patched through their XML, which reflows, so no
layout adjustment was needed; both reopen and convert cleanly.

CONTENT_LOG.md keeps its reference deliberately - line 10 records the
earlier yahoo-to-advisor migration and rewriting it would falsify the
log.

The repo is now clean: 0 old refs in any tracked text file and 0 in any
tracked PDF, DOCX, PPTX or XLSX.
</commit_message>
<xml_diff>
--- a/content/Banking-2030-Scoreboard-Part3-Capital-Efficiency.docx
+++ b/content/Banking-2030-Scoreboard-Part3-Capital-Efficiency.docx
@@ -1973,7 +1973,7 @@
           <w:sz w:val="20"/>
           <w:szCs w:val="20"/>
         </w:rPr>
-        <w:t xml:space="preserve">meridian@rodney-ai.com</w:t>
+        <w:t xml:space="preserve">rodney@theenterpriseai.co.uk</w:t>
       </w:r>
       <w:r>
         <w:rPr>
@@ -2468,7 +2468,7 @@
           <w:sz w:val="22"/>
           <w:szCs w:val="22"/>
         </w:rPr>
-        <w:t xml:space="preserve">The open Excel model behind the Scoreboard is available on request. DM or email meridian@rodney-ai.com.</w:t>
+        <w:t xml:space="preserve">The open Excel model behind the Scoreboard is available on request. DM or email rodney@theenterpriseai.co.uk.</w:t>
       </w:r>
     </w:p>
     <w:p>
@@ -2638,7 +2638,7 @@
         <w:sz w:val="16"/>
         <w:szCs w:val="16"/>
       </w:rPr>
-      <w:t xml:space="preserve">meridian@rodney-ai.com  ·  </w:t>
+      <w:t xml:space="preserve">rodney@theenterpriseai.co.uk  ·  </w:t>
     </w:r>
     <w:r>
       <w:rPr>

</xml_diff>